<commit_message>
Quita del documento de Word la sección de la versión interactiva
La conclusión pasa a ser la sección 6.

Co-Authored-By: Claude Opus 5.5 <noreply@anthropic.com>
Claude-Session: https://claude.ai/code/session_01GpVh22YsVCDRo3Hp1NSGFy
</commit_message>
<xml_diff>
--- a/robot-hexapodo/robot-hexapodo.docx
+++ b/robot-hexapodo/robot-hexapodo.docx
@@ -2478,45 +2478,7 @@
         <w:pStyle w:val="Heading1"/>
       </w:pPr>
       <w:r>
-        <w:t xml:space="preserve">6. Versión interactiva</w:t>
-      </w:r>
-    </w:p>
-    <w:p>
-      <w:pPr>
-        <w:spacing w:after="140" w:line="300"/>
-      </w:pPr>
-      <w:r>
-        <w:t xml:space="preserve">También hicimos una versión interactiva del robot en una página web. Ahí se puede encender el motor, cambiar la velocidad de 0 a 100 rpm, ver el ángulo de la polea y la posición del ciclo en vivo, tocar cada pieza para ver su función y revisar el circuito eléctrico.</w:t>
-      </w:r>
-    </w:p>
-    <w:p>
-      <w:pPr>
-        <w:spacing w:after="140"/>
-      </w:pPr>
-      <w:r>
-        <w:rPr>
-          <w:b/>
-          <w:bCs/>
-        </w:rPr>
-        <w:t xml:space="preserve">Enlace: </w:t>
-      </w:r>
-      <w:hyperlink w:history="1" r:id="rIdor13phwkjwffgmxaihvou">
-        <w:r>
-          <w:rPr>
-            <w:rStyle w:val="Hyperlink"/>
-            <w:color w:val="2F5FE0"/>
-            <w:u w:val="single"/>
-          </w:rPr>
-          <w:t xml:space="preserve">https://claude.ai/artifact/RbkppsqGifGw8Zdwvmf7sE</w:t>
-        </w:r>
-      </w:hyperlink>
-    </w:p>
-    <w:p>
-      <w:pPr>
-        <w:pStyle w:val="Heading1"/>
-      </w:pPr>
-      <w:r>
-        <w:t xml:space="preserve">7. Conclusión</w:t>
+        <w:t xml:space="preserve">6. Conclusión</w:t>
       </w:r>
     </w:p>
     <w:p>

</xml_diff>